<commit_message>
docs: remove CLS branding and unify project name to LMSPilot
</commit_message>
<xml_diff>
--- a/HUONG_DAN_DU_AN_LMSPILOT.docx
+++ b/HUONG_DAN_DU_AN_LMSPILOT.docx
@@ -26,7 +26,7 @@
           <w:color w:val="555555"/>
           <w:sz w:val="26"/>
         </w:rPr>
-        <w:t>Phiên bản Tinh gọn Giao diện &amp; Tối ưu Hệ thống — CLS 0.17.0</w:t>
+        <w:t>Phiên bản Tinh gọn Giao diện &amp; Tối ưu Hệ thống — 0.17.0</w:t>
       </w:r>
     </w:p>
     <w:p/>
@@ -119,7 +119,7 @@
         <w:rPr>
           <w:b/>
         </w:rPr>
-        <w:t xml:space="preserve">Phiên bản CLS 0.17.0 tinh gọn: </w:t>
+        <w:t xml:space="preserve">Phiên bản 0.17.0 tinh gọn: </w:t>
       </w:r>
       <w:r>
         <w:t>Tập trung chuẩn hóa giao diện người dùng (Unified Design System), giảm tải độ phức tạp của thanh quản trị admin, đồng thời tối ưu tối đa không gian hiển thị cho bài học và bài kiểm tra thi trắc nghiệm/tự luận.</w:t>
@@ -1338,7 +1338,7 @@
           <w:color w:val="888888"/>
           <w:sz w:val="19"/>
         </w:rPr>
-        <w:t>LMSPilot Team — Bản quyền tài liệu dự án CLS 0.17.0</w:t>
+        <w:t>LMSPilot Team — Bản quyền tài liệu dự án 0.17.0</w:t>
       </w:r>
     </w:p>
     <w:sectPr>

</xml_diff>